<commit_message>
Add Heroicons, chapter-only publishing, CSS class migration in Read.cshtml
</commit_message>
<xml_diff>
--- a/Work Plan.docx
+++ b/Work Plan.docx
@@ -167,7 +167,7 @@
     <w:p>
       <w:r>
         <w:pict w14:anchorId="0E613A8F">
-          <v:rect id="_x0000_i1109" style="width:0;height:1.5pt" o:hralign="center" o:hrstd="t" o:hr="t" fillcolor="#a0a0a0" stroked="f"/>
+          <v:rect id="_x0000_i1025" style="width:0;height:1.5pt" o:hralign="center" o:hrstd="t" o:hr="t" fillcolor="#a0a0a0" stroked="f"/>
         </w:pict>
       </w:r>
     </w:p>
@@ -290,7 +290,7 @@
     <w:p>
       <w:r>
         <w:pict w14:anchorId="43104A21">
-          <v:rect id="_x0000_i1110" style="width:0;height:1.5pt" o:hralign="center" o:hrstd="t" o:hr="t" fillcolor="#a0a0a0" stroked="f"/>
+          <v:rect id="_x0000_i1026" style="width:0;height:1.5pt" o:hralign="center" o:hrstd="t" o:hr="t" fillcolor="#a0a0a0" stroked="f"/>
         </w:pict>
       </w:r>
     </w:p>
@@ -445,7 +445,7 @@
     <w:p>
       <w:r>
         <w:pict w14:anchorId="62F8A715">
-          <v:rect id="_x0000_i1111" style="width:0;height:1.5pt" o:hralign="center" o:hrstd="t" o:hr="t" fillcolor="#a0a0a0" stroked="f"/>
+          <v:rect id="_x0000_i1027" style="width:0;height:1.5pt" o:hralign="center" o:hrstd="t" o:hr="t" fillcolor="#a0a0a0" stroked="f"/>
         </w:pict>
       </w:r>
     </w:p>
@@ -653,7 +653,7 @@
     <w:p>
       <w:r>
         <w:pict w14:anchorId="782EBB53">
-          <v:rect id="_x0000_i1112" style="width:0;height:1.5pt" o:hralign="center" o:hrstd="t" o:hr="t" fillcolor="#a0a0a0" stroked="f"/>
+          <v:rect id="_x0000_i1028" style="width:0;height:1.5pt" o:hralign="center" o:hrstd="t" o:hr="t" fillcolor="#a0a0a0" stroked="f"/>
         </w:pict>
       </w:r>
     </w:p>
@@ -770,7 +770,7 @@
     <w:p>
       <w:r>
         <w:pict w14:anchorId="33D5522B">
-          <v:rect id="_x0000_i1113" style="width:0;height:1.5pt" o:hralign="center" o:hrstd="t" o:hr="t" fillcolor="#a0a0a0" stroked="f"/>
+          <v:rect id="_x0000_i1029" style="width:0;height:1.5pt" o:hralign="center" o:hrstd="t" o:hr="t" fillcolor="#a0a0a0" stroked="f"/>
         </w:pict>
       </w:r>
     </w:p>
@@ -877,7 +877,7 @@
     <w:p>
       <w:r>
         <w:pict w14:anchorId="19BE0E92">
-          <v:rect id="_x0000_i1114" style="width:0;height:1.5pt" o:hralign="center" o:hrstd="t" o:hr="t" fillcolor="#a0a0a0" stroked="f"/>
+          <v:rect id="_x0000_i1030" style="width:0;height:1.5pt" o:hralign="center" o:hrstd="t" o:hr="t" fillcolor="#a0a0a0" stroked="f"/>
         </w:pict>
       </w:r>
     </w:p>
@@ -1000,7 +1000,7 @@
     <w:p>
       <w:r>
         <w:pict w14:anchorId="2B41AD70">
-          <v:rect id="_x0000_i1115" style="width:0;height:1.5pt" o:hralign="center" o:hrstd="t" o:hr="t" fillcolor="#a0a0a0" stroked="f"/>
+          <v:rect id="_x0000_i1031" style="width:0;height:1.5pt" o:hralign="center" o:hrstd="t" o:hr="t" fillcolor="#a0a0a0" stroked="f"/>
         </w:pict>
       </w:r>
     </w:p>
@@ -1107,7 +1107,7 @@
     <w:p>
       <w:r>
         <w:pict w14:anchorId="11A77696">
-          <v:rect id="_x0000_i1116" style="width:0;height:1.5pt" o:hralign="center" o:hrstd="t" o:hr="t" fillcolor="#a0a0a0" stroked="f"/>
+          <v:rect id="_x0000_i1032" style="width:0;height:1.5pt" o:hralign="center" o:hrstd="t" o:hr="t" fillcolor="#a0a0a0" stroked="f"/>
         </w:pict>
       </w:r>
     </w:p>
@@ -1214,7 +1214,7 @@
     <w:p>
       <w:r>
         <w:pict w14:anchorId="607D0440">
-          <v:rect id="_x0000_i1117" style="width:0;height:1.5pt" o:hralign="center" o:hrstd="t" o:hr="t" fillcolor="#a0a0a0" stroked="f"/>
+          <v:rect id="_x0000_i1033" style="width:0;height:1.5pt" o:hralign="center" o:hrstd="t" o:hr="t" fillcolor="#a0a0a0" stroked="f"/>
         </w:pict>
       </w:r>
     </w:p>
@@ -1347,7 +1347,7 @@
     <w:p>
       <w:r>
         <w:pict w14:anchorId="3718E816">
-          <v:rect id="_x0000_i1118" style="width:0;height:1.5pt" o:hralign="center" o:hrstd="t" o:hr="t" fillcolor="#a0a0a0" stroked="f"/>
+          <v:rect id="_x0000_i1034" style="width:0;height:1.5pt" o:hralign="center" o:hrstd="t" o:hr="t" fillcolor="#a0a0a0" stroked="f"/>
         </w:pict>
       </w:r>
     </w:p>
@@ -1454,7 +1454,7 @@
     <w:p>
       <w:r>
         <w:pict w14:anchorId="518C6FDB">
-          <v:rect id="_x0000_i1119" style="width:0;height:1.5pt" o:hralign="center" o:hrstd="t" o:hr="t" fillcolor="#a0a0a0" stroked="f"/>
+          <v:rect id="_x0000_i1035" style="width:0;height:1.5pt" o:hralign="center" o:hrstd="t" o:hr="t" fillcolor="#a0a0a0" stroked="f"/>
         </w:pict>
       </w:r>
     </w:p>
@@ -1550,7 +1550,7 @@
     <w:p>
       <w:r>
         <w:pict w14:anchorId="13ABF290">
-          <v:rect id="_x0000_i1120" style="width:0;height:1.5pt" o:hralign="center" o:hrstd="t" o:hr="t" fillcolor="#a0a0a0" stroked="f"/>
+          <v:rect id="_x0000_i1036" style="width:0;height:1.5pt" o:hralign="center" o:hrstd="t" o:hr="t" fillcolor="#a0a0a0" stroked="f"/>
         </w:pict>
       </w:r>
     </w:p>
@@ -1716,7 +1716,7 @@
     <w:p>
       <w:r>
         <w:pict w14:anchorId="46853529">
-          <v:rect id="_x0000_i1121" style="width:0;height:1.5pt" o:hralign="center" o:hrstd="t" o:hr="t" fillcolor="#a0a0a0" stroked="f"/>
+          <v:rect id="_x0000_i1037" style="width:0;height:1.5pt" o:hralign="center" o:hrstd="t" o:hr="t" fillcolor="#a0a0a0" stroked="f"/>
         </w:pict>
       </w:r>
     </w:p>
@@ -1905,7 +1905,7 @@
     <w:p>
       <w:r>
         <w:pict w14:anchorId="7F553E3B">
-          <v:rect id="_x0000_i1122" style="width:0;height:1.5pt" o:hralign="center" o:hrstd="t" o:hr="t" fillcolor="#a0a0a0" stroked="f"/>
+          <v:rect id="_x0000_i1038" style="width:0;height:1.5pt" o:hralign="center" o:hrstd="t" o:hr="t" fillcolor="#a0a0a0" stroked="f"/>
         </w:pict>
       </w:r>
     </w:p>

</xml_diff>